<commit_message>
update project word file
</commit_message>
<xml_diff>
--- a/Phase-B/Capstone Project - Phase B - 25-1-D-17.docx
+++ b/Phase-B/Capstone Project - Phase B - 25-1-D-17.docx
@@ -2894,7 +2894,23 @@
           <w:sz w:val="24"/>
           <w:szCs w:val="24"/>
         </w:rPr>
-        <w:t>using React, Next.js (</w:t>
+        <w:t>using React, Next.js</w:t>
+      </w:r>
+      <w:r>
+        <w:rPr>
+          <w:rFonts w:asciiTheme="majorBidi" w:hAnsiTheme="majorBidi" w:cstheme="majorBidi"/>
+          <w:sz w:val="24"/>
+          <w:szCs w:val="24"/>
+        </w:rPr>
+        <w:t xml:space="preserve"> API Routes</w:t>
+      </w:r>
+      <w:r>
+        <w:rPr>
+          <w:rFonts w:asciiTheme="majorBidi" w:hAnsiTheme="majorBidi" w:cstheme="majorBidi"/>
+          <w:sz w:val="24"/>
+          <w:szCs w:val="24"/>
+        </w:rPr>
+        <w:t xml:space="preserve"> (</w:t>
       </w:r>
       <w:r>
         <w:rPr>
@@ -9571,7 +9587,7 @@
           <w:noProof/>
         </w:rPr>
         <w:drawing>
-          <wp:anchor distT="0" distB="0" distL="114300" distR="114300" simplePos="0" relativeHeight="251678720" behindDoc="0" locked="0" layoutInCell="1" allowOverlap="1" wp14:anchorId="252BF5E9" wp14:editId="2E241214">
+          <wp:anchor distT="0" distB="0" distL="114300" distR="114300" simplePos="0" relativeHeight="251678720" behindDoc="0" locked="0" layoutInCell="1" allowOverlap="1" wp14:anchorId="252BF5E9" wp14:editId="7882AB18">
             <wp:simplePos x="0" y="0"/>
             <wp:positionH relativeFrom="margin">
               <wp:posOffset>1286510</wp:posOffset>
@@ -11331,7 +11347,7 @@
         </w:rPr>
         <w:lastRenderedPageBreak/>
         <w:drawing>
-          <wp:anchor distT="0" distB="0" distL="114300" distR="114300" simplePos="0" relativeHeight="251687936" behindDoc="0" locked="0" layoutInCell="1" allowOverlap="1" wp14:anchorId="2A4C62AE" wp14:editId="422204EF">
+          <wp:anchor distT="0" distB="0" distL="114300" distR="114300" simplePos="0" relativeHeight="251687936" behindDoc="0" locked="0" layoutInCell="1" allowOverlap="1" wp14:anchorId="2A4C62AE" wp14:editId="053FB801">
             <wp:simplePos x="0" y="0"/>
             <wp:positionH relativeFrom="margin">
               <wp:posOffset>338455</wp:posOffset>
@@ -11520,7 +11536,7 @@
           <w:noProof/>
         </w:rPr>
         <w:drawing>
-          <wp:anchor distT="0" distB="0" distL="114300" distR="114300" simplePos="0" relativeHeight="251688960" behindDoc="0" locked="0" layoutInCell="1" allowOverlap="1" wp14:anchorId="774C540C" wp14:editId="3AE36EE4">
+          <wp:anchor distT="0" distB="0" distL="114300" distR="114300" simplePos="0" relativeHeight="251688960" behindDoc="0" locked="0" layoutInCell="1" allowOverlap="1" wp14:anchorId="774C540C" wp14:editId="359DE3FA">
             <wp:simplePos x="0" y="0"/>
             <wp:positionH relativeFrom="margin">
               <wp:posOffset>57150</wp:posOffset>

</xml_diff>

<commit_message>
fix spaces between sections in the project word file
</commit_message>
<xml_diff>
--- a/Phase-B/Capstone Project - Phase B - 25-1-D-17.docx
+++ b/Phase-B/Capstone Project - Phase B - 25-1-D-17.docx
@@ -9065,15 +9065,6 @@
     <w:p>
       <w:pPr>
         <w:pStyle w:val="Heading1"/>
-        <w:rPr>
-          <w:b w:val="0"/>
-          <w:bCs w:val="0"/>
-        </w:rPr>
-      </w:pPr>
-    </w:p>
-    <w:p>
-      <w:pPr>
-        <w:pStyle w:val="Heading1"/>
       </w:pPr>
       <w:bookmarkStart w:id="15" w:name="_Toc204688384"/>
       <w:r>
@@ -9331,7 +9322,6 @@
       </w:pPr>
       <w:bookmarkStart w:id="17" w:name="_Toc204688386"/>
       <w:r>
-        <w:lastRenderedPageBreak/>
         <w:t>7</w:t>
       </w:r>
       <w:r>
@@ -9363,6 +9353,7 @@
           <w:color w:val="215E99" w:themeColor="text2" w:themeTint="BF"/>
           <w:u w:val="single"/>
         </w:rPr>
+        <w:lastRenderedPageBreak/>
         <w:drawing>
           <wp:anchor distT="0" distB="0" distL="114300" distR="114300" simplePos="0" relativeHeight="251679744" behindDoc="0" locked="0" layoutInCell="1" allowOverlap="1" wp14:anchorId="0C7330A5" wp14:editId="33AFCFA5">
             <wp:simplePos x="0" y="0"/>
@@ -9587,7 +9578,7 @@
           <w:noProof/>
         </w:rPr>
         <w:drawing>
-          <wp:anchor distT="0" distB="0" distL="114300" distR="114300" simplePos="0" relativeHeight="251678720" behindDoc="0" locked="0" layoutInCell="1" allowOverlap="1" wp14:anchorId="252BF5E9" wp14:editId="7882AB18">
+          <wp:anchor distT="0" distB="0" distL="114300" distR="114300" simplePos="0" relativeHeight="251678720" behindDoc="0" locked="0" layoutInCell="1" allowOverlap="1" wp14:anchorId="252BF5E9" wp14:editId="3817B4F3">
             <wp:simplePos x="0" y="0"/>
             <wp:positionH relativeFrom="margin">
               <wp:posOffset>1286510</wp:posOffset>
@@ -9750,7 +9741,6 @@
           <w:szCs w:val="24"/>
           <w:u w:val="single"/>
         </w:rPr>
-        <w:lastRenderedPageBreak/>
         <w:t>Sign In Page:</w:t>
       </w:r>
     </w:p>
@@ -9771,6 +9761,7 @@
           <w:color w:val="215E99" w:themeColor="text2" w:themeTint="BF"/>
           <w:u w:val="single"/>
         </w:rPr>
+        <w:lastRenderedPageBreak/>
         <w:drawing>
           <wp:anchor distT="0" distB="0" distL="114300" distR="114300" simplePos="0" relativeHeight="251680768" behindDoc="0" locked="0" layoutInCell="1" allowOverlap="1" wp14:anchorId="7C9AA9E5" wp14:editId="2C2D245E">
             <wp:simplePos x="0" y="0"/>
@@ -11347,7 +11338,7 @@
         </w:rPr>
         <w:lastRenderedPageBreak/>
         <w:drawing>
-          <wp:anchor distT="0" distB="0" distL="114300" distR="114300" simplePos="0" relativeHeight="251687936" behindDoc="0" locked="0" layoutInCell="1" allowOverlap="1" wp14:anchorId="2A4C62AE" wp14:editId="053FB801">
+          <wp:anchor distT="0" distB="0" distL="114300" distR="114300" simplePos="0" relativeHeight="251687936" behindDoc="0" locked="0" layoutInCell="1" allowOverlap="1" wp14:anchorId="2A4C62AE" wp14:editId="5637DC9F">
             <wp:simplePos x="0" y="0"/>
             <wp:positionH relativeFrom="margin">
               <wp:posOffset>338455</wp:posOffset>
@@ -11536,7 +11527,7 @@
           <w:noProof/>
         </w:rPr>
         <w:drawing>
-          <wp:anchor distT="0" distB="0" distL="114300" distR="114300" simplePos="0" relativeHeight="251688960" behindDoc="0" locked="0" layoutInCell="1" allowOverlap="1" wp14:anchorId="774C540C" wp14:editId="359DE3FA">
+          <wp:anchor distT="0" distB="0" distL="114300" distR="114300" simplePos="0" relativeHeight="251688960" behindDoc="0" locked="0" layoutInCell="1" allowOverlap="1" wp14:anchorId="774C540C" wp14:editId="3895645C">
             <wp:simplePos x="0" y="0"/>
             <wp:positionH relativeFrom="margin">
               <wp:posOffset>57150</wp:posOffset>
@@ -15078,18 +15069,6 @@
         </w:rPr>
         <w:t xml:space="preserve"> Handles signup form submission, validates password matching, sends data to /api/signup, and displays appropriate feedback.</w:t>
       </w:r>
-    </w:p>
-    <w:p>
-      <w:pPr>
-        <w:bidi w:val="0"/>
-        <w:rPr>
-          <w:rFonts w:asciiTheme="majorBidi" w:hAnsiTheme="majorBidi" w:cstheme="majorBidi"/>
-          <w:b/>
-          <w:bCs/>
-          <w:sz w:val="24"/>
-          <w:szCs w:val="24"/>
-        </w:rPr>
-      </w:pPr>
     </w:p>
     <w:p>
       <w:pPr>

</xml_diff>